<commit_message>
Requirements Engineering: Spezifikation ArenaOne (Word/PDF) nach Abnahme neu gebaut
</commit_message>
<xml_diff>
--- a/requirements-engineering/re-arenaone/anforderungsspezifikation-arenaone.docx
+++ b/requirements-engineering/re-arenaone/anforderungsspezifikation-arenaone.docx
@@ -52547,26 +52547,7 @@
                 <w:szCs w:val="18"/>
                 <w:lang w:val="de-CH"/>
               </w:rPr>
-              <w:t xml:space="preserve">Befunde aus dem KI-Versuch (RE 10): sechs Widersprüche und eine Lücke behoben (PB-10 bis PB-16: FA-18, FA-26, QA-13, QA-15, PA-02, neuer Parameter PA-11), fünf neue offene Punkte OP-18 bis OP-22, Ergänzungen in OP-03, OP-05, OP-06, OP-08, OP-13, OP-17. Keine Anforderung neu oder gestrichen. Nach der internen Abnahme (</w:t>
-            </w:r>
-            <w:hyperlink r:id="rIdInhalt13">
-              <w:r>
-                <w:rPr>
-                  <w:rStyle w:val="Hyperlink"/>
-                  <w:sz w:val="18"/>
-                  <w:szCs w:val="18"/>
-                  <w:lang w:val="de-CH"/>
-                </w:rPr>
-                <w:t xml:space="preserve">abnahme.md</w:t>
-              </w:r>
-            </w:hyperlink>
-            <w:r>
-              <w:rPr>
-                <w:sz w:val="18"/>
-                <w:szCs w:val="18"/>
-                <w:lang w:val="de-CH"/>
-              </w:rPr>
-              <w:t xml:space="preserve">): zweiter Faktor für Mitarbeitende aus dem Akzeptanzkriterium in den Satz von QA-14 übernommen, Titel von FA-12 ohne «sofort» (Zeitbedarf regelt QA-09), Glossarzeile «Stornofrist» korrigiert, Versionsangaben nachgeführt.</w:t>
+              <w:t xml:space="preserve">Befunde aus dem KI-Versuch (RE 10): sechs Widersprüche und eine Lücke behoben (PB-10 bis PB-16: FA-18, FA-26, QA-13, QA-15, PA-02, neuer Parameter PA-11), fünf neue offene Punkte OP-18 bis OP-22, Ergänzungen in OP-03, OP-05, OP-06, OP-08, OP-13, OP-17. Keine Anforderung neu oder gestrichen. Nach der internen Abnahme: zweiter Faktor für Mitarbeitende aus dem Akzeptanzkriterium in den Satz von QA-14 übernommen, Titel von FA-12 ohne «sofort» (Zeitbedarf regelt QA-09), Glossarzeile «Stornofrist» korrigiert, Versionsangaben nachgeführt.</w:t>
             </w:r>
           </w:p>
         </w:tc>
@@ -52796,7 +52777,7 @@
         </w:rPr>
         <w:t xml:space="preserve"> </w:t>
       </w:r>
-      <w:hyperlink r:id="rIdInhalt14">
+      <w:hyperlink r:id="rIdInhalt13">
         <w:r>
           <w:rPr>
             <w:rStyle w:val="Hyperlink"/>
@@ -58254,7 +58235,7 @@
         </w:rPr>
         <w:t xml:space="preserve"> </w:t>
       </w:r>
-      <w:hyperlink r:id="rIdInhalt15">
+      <w:hyperlink r:id="rIdInhalt14">
         <w:r>
           <w:rPr>
             <w:rStyle w:val="Hyperlink"/>
@@ -58380,7 +58361,7 @@
         </w:rPr>
         <w:t xml:space="preserve"> </w:t>
       </w:r>
-      <w:hyperlink r:id="rIdInhalt16">
+      <w:hyperlink r:id="rIdInhalt15">
         <w:r>
           <w:rPr>
             <w:rStyle w:val="Hyperlink"/>

</xml_diff>